<commit_message>
Final submission sync for PoE Part 1
</commit_message>
<xml_diff>
--- a/research/Omari WEDE5020 Part 1.docx
+++ b/research/Omari WEDE5020 Part 1.docx
@@ -10,6 +10,7 @@
           <w:bCs/>
           <w:sz w:val="56"/>
           <w:szCs w:val="56"/>
+          <w:u w:val="double"/>
           <w:lang w:val="en-US"/>
         </w:rPr>
       </w:pPr>
@@ -19,6 +20,7 @@
           <w:bCs/>
           <w:sz w:val="56"/>
           <w:szCs w:val="56"/>
+          <w:u w:val="double"/>
           <w:lang w:val="en-US"/>
         </w:rPr>
         <w:t>Mima Omari</w:t>
@@ -32,6 +34,7 @@
           <w:bCs/>
           <w:sz w:val="56"/>
           <w:szCs w:val="56"/>
+          <w:u w:val="double"/>
           <w:lang w:val="en-US"/>
         </w:rPr>
       </w:pPr>
@@ -41,6 +44,7 @@
           <w:bCs/>
           <w:sz w:val="56"/>
           <w:szCs w:val="56"/>
+          <w:u w:val="double"/>
           <w:lang w:val="en-US"/>
         </w:rPr>
         <w:t>ST10480786</w:t>
@@ -54,6 +58,7 @@
           <w:bCs/>
           <w:sz w:val="56"/>
           <w:szCs w:val="56"/>
+          <w:u w:val="double"/>
           <w:lang w:val="en-US"/>
         </w:rPr>
       </w:pPr>
@@ -63,6 +68,7 @@
           <w:bCs/>
           <w:sz w:val="56"/>
           <w:szCs w:val="56"/>
+          <w:u w:val="double"/>
           <w:lang w:val="en-US"/>
         </w:rPr>
         <w:t>Web Development – WEDE5020</w:t>
@@ -76,6 +82,7 @@
           <w:bCs/>
           <w:sz w:val="56"/>
           <w:szCs w:val="56"/>
+          <w:u w:val="double"/>
           <w:lang w:val="en-US"/>
         </w:rPr>
       </w:pPr>
@@ -85,6 +92,7 @@
           <w:bCs/>
           <w:sz w:val="56"/>
           <w:szCs w:val="56"/>
+          <w:u w:val="double"/>
           <w:lang w:val="en-US"/>
         </w:rPr>
         <w:t>Part 1</w:t>
@@ -2996,6 +3004,414 @@
         </w:drawing>
       </w:r>
     </w:p>
+    <w:p>
+      <w:pPr>
+        <w:pStyle w:val="Heading1"/>
+        <w:rPr>
+          <w:u w:val="double"/>
+          <w:lang w:val="en-US"/>
+        </w:rPr>
+      </w:pPr>
+      <w:r>
+        <w:rPr>
+          <w:u w:val="double"/>
+          <w:lang w:val="en-US"/>
+        </w:rPr>
+        <w:t>References</w:t>
+      </w:r>
+    </w:p>
+    <w:p>
+      <w:pPr>
+        <w:numPr>
+          <w:ilvl w:val="0"/>
+          <w:numId w:val="20"/>
+        </w:numPr>
+        <w:spacing w:line="360" w:lineRule="auto"/>
+        <w:ind w:left="714" w:hanging="357"/>
+        <w:rPr>
+          <w:b/>
+          <w:bCs/>
+          <w:sz w:val="22"/>
+          <w:szCs w:val="22"/>
+        </w:rPr>
+      </w:pPr>
+      <w:r>
+        <w:rPr>
+          <w:b/>
+          <w:bCs/>
+          <w:sz w:val="22"/>
+          <w:szCs w:val="22"/>
+        </w:rPr>
+        <w:t xml:space="preserve">Google Fonts (2026). </w:t>
+      </w:r>
+      <w:r>
+        <w:rPr>
+          <w:b/>
+          <w:bCs/>
+          <w:i/>
+          <w:iCs/>
+          <w:sz w:val="22"/>
+          <w:szCs w:val="22"/>
+        </w:rPr>
+        <w:t>Montserrat &amp; Inter Typeface Pairings</w:t>
+      </w:r>
+      <w:r>
+        <w:rPr>
+          <w:b/>
+          <w:bCs/>
+          <w:sz w:val="22"/>
+          <w:szCs w:val="22"/>
+        </w:rPr>
+        <w:t xml:space="preserve">. Available at: </w:t>
+      </w:r>
+      <w:hyperlink r:id="rId14" w:tgtFrame="_blank" w:history="1">
+        <w:r>
+          <w:rPr>
+            <w:rStyle w:val="Hyperlink"/>
+            <w:b/>
+            <w:bCs/>
+            <w:sz w:val="22"/>
+            <w:szCs w:val="22"/>
+          </w:rPr>
+          <w:t>https://fonts.google.com</w:t>
+        </w:r>
+      </w:hyperlink>
+      <w:r>
+        <w:rPr>
+          <w:b/>
+          <w:bCs/>
+          <w:sz w:val="22"/>
+          <w:szCs w:val="22"/>
+        </w:rPr>
+        <w:t xml:space="preserve"> (Accessed: 15 August 2026).</w:t>
+      </w:r>
+    </w:p>
+    <w:p>
+      <w:pPr>
+        <w:numPr>
+          <w:ilvl w:val="0"/>
+          <w:numId w:val="20"/>
+        </w:numPr>
+        <w:spacing w:line="360" w:lineRule="auto"/>
+        <w:ind w:left="714" w:hanging="357"/>
+        <w:rPr>
+          <w:b/>
+          <w:bCs/>
+          <w:sz w:val="22"/>
+          <w:szCs w:val="22"/>
+        </w:rPr>
+      </w:pPr>
+      <w:r>
+        <w:rPr>
+          <w:b/>
+          <w:bCs/>
+          <w:sz w:val="22"/>
+          <w:szCs w:val="22"/>
+        </w:rPr>
+        <w:t xml:space="preserve">Google Fonts (2026). </w:t>
+      </w:r>
+      <w:r>
+        <w:rPr>
+          <w:b/>
+          <w:bCs/>
+          <w:i/>
+          <w:iCs/>
+          <w:sz w:val="22"/>
+          <w:szCs w:val="22"/>
+        </w:rPr>
+        <w:t>Poppins &amp; Nunito Font Families</w:t>
+      </w:r>
+      <w:r>
+        <w:rPr>
+          <w:b/>
+          <w:bCs/>
+          <w:sz w:val="22"/>
+          <w:szCs w:val="22"/>
+        </w:rPr>
+        <w:t xml:space="preserve">. Available at: </w:t>
+      </w:r>
+      <w:hyperlink r:id="rId15" w:tgtFrame="_blank" w:history="1">
+        <w:r>
+          <w:rPr>
+            <w:rStyle w:val="Hyperlink"/>
+            <w:b/>
+            <w:bCs/>
+            <w:sz w:val="22"/>
+            <w:szCs w:val="22"/>
+          </w:rPr>
+          <w:t>https://fonts.google.com</w:t>
+        </w:r>
+      </w:hyperlink>
+      <w:r>
+        <w:rPr>
+          <w:b/>
+          <w:bCs/>
+          <w:sz w:val="22"/>
+          <w:szCs w:val="22"/>
+        </w:rPr>
+        <w:t xml:space="preserve"> (Accessed: 15 August 2026).</w:t>
+      </w:r>
+    </w:p>
+    <w:p>
+      <w:pPr>
+        <w:numPr>
+          <w:ilvl w:val="0"/>
+          <w:numId w:val="20"/>
+        </w:numPr>
+        <w:spacing w:line="360" w:lineRule="auto"/>
+        <w:ind w:left="714" w:hanging="357"/>
+        <w:rPr>
+          <w:b/>
+          <w:bCs/>
+          <w:sz w:val="22"/>
+          <w:szCs w:val="22"/>
+        </w:rPr>
+      </w:pPr>
+      <w:proofErr w:type="spellStart"/>
+      <w:r>
+        <w:rPr>
+          <w:b/>
+          <w:bCs/>
+          <w:sz w:val="22"/>
+          <w:szCs w:val="22"/>
+        </w:rPr>
+        <w:t>Unsplash</w:t>
+      </w:r>
+      <w:proofErr w:type="spellEnd"/>
+      <w:r>
+        <w:rPr>
+          <w:b/>
+          <w:bCs/>
+          <w:sz w:val="22"/>
+          <w:szCs w:val="22"/>
+        </w:rPr>
+        <w:t xml:space="preserve"> (2026). </w:t>
+      </w:r>
+      <w:r>
+        <w:rPr>
+          <w:b/>
+          <w:bCs/>
+          <w:i/>
+          <w:iCs/>
+          <w:sz w:val="22"/>
+          <w:szCs w:val="22"/>
+        </w:rPr>
+        <w:t>Animal Rescue and Companion Pet Photography Collection</w:t>
+      </w:r>
+      <w:r>
+        <w:rPr>
+          <w:b/>
+          <w:bCs/>
+          <w:sz w:val="22"/>
+          <w:szCs w:val="22"/>
+        </w:rPr>
+        <w:t xml:space="preserve">. Available at: </w:t>
+      </w:r>
+      <w:hyperlink r:id="rId16" w:tgtFrame="_blank" w:history="1">
+        <w:r>
+          <w:rPr>
+            <w:rStyle w:val="Hyperlink"/>
+            <w:b/>
+            <w:bCs/>
+            <w:sz w:val="22"/>
+            <w:szCs w:val="22"/>
+          </w:rPr>
+          <w:t>https://unsplash.com</w:t>
+        </w:r>
+      </w:hyperlink>
+      <w:r>
+        <w:rPr>
+          <w:b/>
+          <w:bCs/>
+          <w:sz w:val="22"/>
+          <w:szCs w:val="22"/>
+        </w:rPr>
+        <w:t xml:space="preserve"> (Accessed: 15 August 2026).</w:t>
+      </w:r>
+    </w:p>
+    <w:p>
+      <w:pPr>
+        <w:numPr>
+          <w:ilvl w:val="0"/>
+          <w:numId w:val="20"/>
+        </w:numPr>
+        <w:spacing w:line="360" w:lineRule="auto"/>
+        <w:ind w:left="714" w:hanging="357"/>
+        <w:rPr>
+          <w:b/>
+          <w:bCs/>
+          <w:sz w:val="22"/>
+          <w:szCs w:val="22"/>
+        </w:rPr>
+      </w:pPr>
+      <w:proofErr w:type="spellStart"/>
+      <w:r>
+        <w:rPr>
+          <w:b/>
+          <w:bCs/>
+          <w:sz w:val="22"/>
+          <w:szCs w:val="22"/>
+        </w:rPr>
+        <w:t>Unsplash</w:t>
+      </w:r>
+      <w:proofErr w:type="spellEnd"/>
+      <w:r>
+        <w:rPr>
+          <w:b/>
+          <w:bCs/>
+          <w:sz w:val="22"/>
+          <w:szCs w:val="22"/>
+        </w:rPr>
+        <w:t xml:space="preserve"> (2026). </w:t>
+      </w:r>
+      <w:r>
+        <w:rPr>
+          <w:b/>
+          <w:bCs/>
+          <w:i/>
+          <w:iCs/>
+          <w:sz w:val="22"/>
+          <w:szCs w:val="22"/>
+        </w:rPr>
+        <w:t>Urban Streetwear and Apparel Photography Collection</w:t>
+      </w:r>
+      <w:r>
+        <w:rPr>
+          <w:b/>
+          <w:bCs/>
+          <w:sz w:val="22"/>
+          <w:szCs w:val="22"/>
+        </w:rPr>
+        <w:t xml:space="preserve">. Available at: </w:t>
+      </w:r>
+      <w:hyperlink r:id="rId17" w:tgtFrame="_blank" w:history="1">
+        <w:r>
+          <w:rPr>
+            <w:rStyle w:val="Hyperlink"/>
+            <w:b/>
+            <w:bCs/>
+            <w:sz w:val="22"/>
+            <w:szCs w:val="22"/>
+          </w:rPr>
+          <w:t>https://unsplash.com</w:t>
+        </w:r>
+      </w:hyperlink>
+      <w:r>
+        <w:rPr>
+          <w:b/>
+          <w:bCs/>
+          <w:sz w:val="22"/>
+          <w:szCs w:val="22"/>
+        </w:rPr>
+        <w:t xml:space="preserve"> (Accessed: 15 August 2026).</w:t>
+      </w:r>
+    </w:p>
+    <w:p>
+      <w:pPr>
+        <w:numPr>
+          <w:ilvl w:val="0"/>
+          <w:numId w:val="20"/>
+        </w:numPr>
+        <w:spacing w:line="360" w:lineRule="auto"/>
+        <w:ind w:left="714" w:hanging="357"/>
+        <w:rPr>
+          <w:b/>
+          <w:bCs/>
+          <w:sz w:val="22"/>
+          <w:szCs w:val="22"/>
+        </w:rPr>
+      </w:pPr>
+      <w:r>
+        <w:rPr>
+          <w:b/>
+          <w:bCs/>
+          <w:sz w:val="22"/>
+          <w:szCs w:val="22"/>
+        </w:rPr>
+        <w:lastRenderedPageBreak/>
+        <w:t xml:space="preserve">W3C (2023). </w:t>
+      </w:r>
+      <w:r>
+        <w:rPr>
+          <w:b/>
+          <w:bCs/>
+          <w:i/>
+          <w:iCs/>
+          <w:sz w:val="22"/>
+          <w:szCs w:val="22"/>
+        </w:rPr>
+        <w:t>HTML5 Semantic Elements Specification</w:t>
+      </w:r>
+      <w:r>
+        <w:rPr>
+          <w:b/>
+          <w:bCs/>
+          <w:sz w:val="22"/>
+          <w:szCs w:val="22"/>
+        </w:rPr>
+        <w:t xml:space="preserve">. Available at: </w:t>
+      </w:r>
+      <w:hyperlink r:id="rId18" w:tgtFrame="_blank" w:history="1">
+        <w:r>
+          <w:rPr>
+            <w:rStyle w:val="Hyperlink"/>
+            <w:b/>
+            <w:bCs/>
+            <w:sz w:val="22"/>
+            <w:szCs w:val="22"/>
+          </w:rPr>
+          <w:t>https://www.w3.org/TR/html52/</w:t>
+        </w:r>
+      </w:hyperlink>
+      <w:r>
+        <w:rPr>
+          <w:b/>
+          <w:bCs/>
+          <w:sz w:val="22"/>
+          <w:szCs w:val="22"/>
+        </w:rPr>
+        <w:t xml:space="preserve"> (Accessed: 15 August 2026).</w:t>
+      </w:r>
+    </w:p>
+    <w:p>
+      <w:pPr>
+        <w:numPr>
+          <w:ilvl w:val="0"/>
+          <w:numId w:val="20"/>
+        </w:numPr>
+      </w:pPr>
+      <w:r>
+        <w:t xml:space="preserve">World Wide Web Consortium (2024). </w:t>
+      </w:r>
+      <w:r>
+        <w:rPr>
+          <w:i/>
+          <w:iCs/>
+        </w:rPr>
+        <w:t>Web Content Accessibility Guidelines (WCAG) 2.2</w:t>
+      </w:r>
+      <w:r>
+        <w:t xml:space="preserve">. Available at: </w:t>
+      </w:r>
+      <w:hyperlink r:id="rId19" w:tgtFrame="_blank" w:history="1">
+        <w:r>
+          <w:rPr>
+            <w:rStyle w:val="Hyperlink"/>
+          </w:rPr>
+          <w:t>https://www.w3.org/WAI/standards-guidelines/wcag/</w:t>
+        </w:r>
+      </w:hyperlink>
+      <w:r>
+        <w:t xml:space="preserve"> (Accessed: 15 August 2026).</w:t>
+      </w:r>
+    </w:p>
+    <w:p>
+      <w:pPr>
+        <w:rPr>
+          <w:lang w:val="en-US"/>
+        </w:rPr>
+      </w:pPr>
+    </w:p>
     <w:sectPr>
       <w:pgSz w:w="11906" w:h="16838"/>
       <w:pgMar w:top="1440" w:right="1440" w:bottom="1440" w:left="1440" w:header="708" w:footer="708" w:gutter="0"/>
@@ -3456,6 +3872,155 @@
     </w:lvl>
   </w:abstractNum>
   <w:abstractNum w:abstractNumId="3" w15:restartNumberingAfterBreak="0">
+    <w:nsid w:val="1EFD7728"/>
+    <w:multiLevelType w:val="multilevel"/>
+    <w:tmpl w:val="0D70EB8C"/>
+    <w:lvl w:ilvl="0">
+      <w:start w:val="1"/>
+      <w:numFmt w:val="bullet"/>
+      <w:lvlText w:val=""/>
+      <w:lvlJc w:val="left"/>
+      <w:pPr>
+        <w:tabs>
+          <w:tab w:val="num" w:pos="720"/>
+        </w:tabs>
+        <w:ind w:left="720" w:hanging="360"/>
+      </w:pPr>
+      <w:rPr>
+        <w:rFonts w:ascii="Symbol" w:hAnsi="Symbol" w:hint="default"/>
+        <w:sz w:val="20"/>
+      </w:rPr>
+    </w:lvl>
+    <w:lvl w:ilvl="1" w:tentative="1">
+      <w:start w:val="1"/>
+      <w:numFmt w:val="bullet"/>
+      <w:lvlText w:val="o"/>
+      <w:lvlJc w:val="left"/>
+      <w:pPr>
+        <w:tabs>
+          <w:tab w:val="num" w:pos="1440"/>
+        </w:tabs>
+        <w:ind w:left="1440" w:hanging="360"/>
+      </w:pPr>
+      <w:rPr>
+        <w:rFonts w:ascii="Courier New" w:hAnsi="Courier New" w:hint="default"/>
+        <w:sz w:val="20"/>
+      </w:rPr>
+    </w:lvl>
+    <w:lvl w:ilvl="2" w:tentative="1">
+      <w:start w:val="1"/>
+      <w:numFmt w:val="bullet"/>
+      <w:lvlText w:val=""/>
+      <w:lvlJc w:val="left"/>
+      <w:pPr>
+        <w:tabs>
+          <w:tab w:val="num" w:pos="2160"/>
+        </w:tabs>
+        <w:ind w:left="2160" w:hanging="360"/>
+      </w:pPr>
+      <w:rPr>
+        <w:rFonts w:ascii="Wingdings" w:hAnsi="Wingdings" w:hint="default"/>
+        <w:sz w:val="20"/>
+      </w:rPr>
+    </w:lvl>
+    <w:lvl w:ilvl="3" w:tentative="1">
+      <w:start w:val="1"/>
+      <w:numFmt w:val="bullet"/>
+      <w:lvlText w:val=""/>
+      <w:lvlJc w:val="left"/>
+      <w:pPr>
+        <w:tabs>
+          <w:tab w:val="num" w:pos="2880"/>
+        </w:tabs>
+        <w:ind w:left="2880" w:hanging="360"/>
+      </w:pPr>
+      <w:rPr>
+        <w:rFonts w:ascii="Wingdings" w:hAnsi="Wingdings" w:hint="default"/>
+        <w:sz w:val="20"/>
+      </w:rPr>
+    </w:lvl>
+    <w:lvl w:ilvl="4" w:tentative="1">
+      <w:start w:val="1"/>
+      <w:numFmt w:val="bullet"/>
+      <w:lvlText w:val=""/>
+      <w:lvlJc w:val="left"/>
+      <w:pPr>
+        <w:tabs>
+          <w:tab w:val="num" w:pos="3600"/>
+        </w:tabs>
+        <w:ind w:left="3600" w:hanging="360"/>
+      </w:pPr>
+      <w:rPr>
+        <w:rFonts w:ascii="Wingdings" w:hAnsi="Wingdings" w:hint="default"/>
+        <w:sz w:val="20"/>
+      </w:rPr>
+    </w:lvl>
+    <w:lvl w:ilvl="5" w:tentative="1">
+      <w:start w:val="1"/>
+      <w:numFmt w:val="bullet"/>
+      <w:lvlText w:val=""/>
+      <w:lvlJc w:val="left"/>
+      <w:pPr>
+        <w:tabs>
+          <w:tab w:val="num" w:pos="4320"/>
+        </w:tabs>
+        <w:ind w:left="4320" w:hanging="360"/>
+      </w:pPr>
+      <w:rPr>
+        <w:rFonts w:ascii="Wingdings" w:hAnsi="Wingdings" w:hint="default"/>
+        <w:sz w:val="20"/>
+      </w:rPr>
+    </w:lvl>
+    <w:lvl w:ilvl="6" w:tentative="1">
+      <w:start w:val="1"/>
+      <w:numFmt w:val="bullet"/>
+      <w:lvlText w:val=""/>
+      <w:lvlJc w:val="left"/>
+      <w:pPr>
+        <w:tabs>
+          <w:tab w:val="num" w:pos="5040"/>
+        </w:tabs>
+        <w:ind w:left="5040" w:hanging="360"/>
+      </w:pPr>
+      <w:rPr>
+        <w:rFonts w:ascii="Wingdings" w:hAnsi="Wingdings" w:hint="default"/>
+        <w:sz w:val="20"/>
+      </w:rPr>
+    </w:lvl>
+    <w:lvl w:ilvl="7" w:tentative="1">
+      <w:start w:val="1"/>
+      <w:numFmt w:val="bullet"/>
+      <w:lvlText w:val=""/>
+      <w:lvlJc w:val="left"/>
+      <w:pPr>
+        <w:tabs>
+          <w:tab w:val="num" w:pos="5760"/>
+        </w:tabs>
+        <w:ind w:left="5760" w:hanging="360"/>
+      </w:pPr>
+      <w:rPr>
+        <w:rFonts w:ascii="Wingdings" w:hAnsi="Wingdings" w:hint="default"/>
+        <w:sz w:val="20"/>
+      </w:rPr>
+    </w:lvl>
+    <w:lvl w:ilvl="8" w:tentative="1">
+      <w:start w:val="1"/>
+      <w:numFmt w:val="bullet"/>
+      <w:lvlText w:val=""/>
+      <w:lvlJc w:val="left"/>
+      <w:pPr>
+        <w:tabs>
+          <w:tab w:val="num" w:pos="6480"/>
+        </w:tabs>
+        <w:ind w:left="6480" w:hanging="360"/>
+      </w:pPr>
+      <w:rPr>
+        <w:rFonts w:ascii="Wingdings" w:hAnsi="Wingdings" w:hint="default"/>
+        <w:sz w:val="20"/>
+      </w:rPr>
+    </w:lvl>
+  </w:abstractNum>
+  <w:abstractNum w:abstractNumId="4" w15:restartNumberingAfterBreak="0">
     <w:nsid w:val="20D71766"/>
     <w:multiLevelType w:val="multilevel"/>
     <w:tmpl w:val="D13EADB6"/>
@@ -3604,7 +4169,7 @@
       </w:rPr>
     </w:lvl>
   </w:abstractNum>
-  <w:abstractNum w:abstractNumId="4" w15:restartNumberingAfterBreak="0">
+  <w:abstractNum w:abstractNumId="5" w15:restartNumberingAfterBreak="0">
     <w:nsid w:val="2D9E4F7D"/>
     <w:multiLevelType w:val="multilevel"/>
     <w:tmpl w:val="782CB322"/>
@@ -3753,7 +4318,7 @@
       </w:rPr>
     </w:lvl>
   </w:abstractNum>
-  <w:abstractNum w:abstractNumId="5" w15:restartNumberingAfterBreak="0">
+  <w:abstractNum w:abstractNumId="6" w15:restartNumberingAfterBreak="0">
     <w:nsid w:val="34240155"/>
     <w:multiLevelType w:val="multilevel"/>
     <w:tmpl w:val="B2201AAC"/>
@@ -3902,7 +4467,7 @@
       </w:rPr>
     </w:lvl>
   </w:abstractNum>
-  <w:abstractNum w:abstractNumId="6" w15:restartNumberingAfterBreak="0">
+  <w:abstractNum w:abstractNumId="7" w15:restartNumberingAfterBreak="0">
     <w:nsid w:val="35AC44E5"/>
     <w:multiLevelType w:val="multilevel"/>
     <w:tmpl w:val="80AE2484"/>
@@ -4051,7 +4616,7 @@
       </w:rPr>
     </w:lvl>
   </w:abstractNum>
-  <w:abstractNum w:abstractNumId="7" w15:restartNumberingAfterBreak="0">
+  <w:abstractNum w:abstractNumId="8" w15:restartNumberingAfterBreak="0">
     <w:nsid w:val="396A4971"/>
     <w:multiLevelType w:val="multilevel"/>
     <w:tmpl w:val="4FB08FCC"/>
@@ -4200,7 +4765,7 @@
       </w:rPr>
     </w:lvl>
   </w:abstractNum>
-  <w:abstractNum w:abstractNumId="8" w15:restartNumberingAfterBreak="0">
+  <w:abstractNum w:abstractNumId="9" w15:restartNumberingAfterBreak="0">
     <w:nsid w:val="3C0C4B1E"/>
     <w:multiLevelType w:val="multilevel"/>
     <w:tmpl w:val="2A16FB36"/>
@@ -4349,7 +4914,7 @@
       </w:rPr>
     </w:lvl>
   </w:abstractNum>
-  <w:abstractNum w:abstractNumId="9" w15:restartNumberingAfterBreak="0">
+  <w:abstractNum w:abstractNumId="10" w15:restartNumberingAfterBreak="0">
     <w:nsid w:val="3C5A7BC0"/>
     <w:multiLevelType w:val="multilevel"/>
     <w:tmpl w:val="795E82A2"/>
@@ -4498,7 +5063,7 @@
       </w:rPr>
     </w:lvl>
   </w:abstractNum>
-  <w:abstractNum w:abstractNumId="10" w15:restartNumberingAfterBreak="0">
+  <w:abstractNum w:abstractNumId="11" w15:restartNumberingAfterBreak="0">
     <w:nsid w:val="4CDC5B0B"/>
     <w:multiLevelType w:val="multilevel"/>
     <w:tmpl w:val="0A5E217E"/>
@@ -4647,7 +5212,7 @@
       </w:rPr>
     </w:lvl>
   </w:abstractNum>
-  <w:abstractNum w:abstractNumId="11" w15:restartNumberingAfterBreak="0">
+  <w:abstractNum w:abstractNumId="12" w15:restartNumberingAfterBreak="0">
     <w:nsid w:val="50C67706"/>
     <w:multiLevelType w:val="multilevel"/>
     <w:tmpl w:val="D6A2B9E6"/>
@@ -4796,7 +5361,7 @@
       </w:rPr>
     </w:lvl>
   </w:abstractNum>
-  <w:abstractNum w:abstractNumId="12" w15:restartNumberingAfterBreak="0">
+  <w:abstractNum w:abstractNumId="13" w15:restartNumberingAfterBreak="0">
     <w:nsid w:val="57DD11A1"/>
     <w:multiLevelType w:val="multilevel"/>
     <w:tmpl w:val="00ECB5E6"/>
@@ -4945,7 +5510,7 @@
       </w:rPr>
     </w:lvl>
   </w:abstractNum>
-  <w:abstractNum w:abstractNumId="13" w15:restartNumberingAfterBreak="0">
+  <w:abstractNum w:abstractNumId="14" w15:restartNumberingAfterBreak="0">
     <w:nsid w:val="5CAE5170"/>
     <w:multiLevelType w:val="multilevel"/>
     <w:tmpl w:val="F6A48894"/>
@@ -5094,7 +5659,7 @@
       </w:rPr>
     </w:lvl>
   </w:abstractNum>
-  <w:abstractNum w:abstractNumId="14" w15:restartNumberingAfterBreak="0">
+  <w:abstractNum w:abstractNumId="15" w15:restartNumberingAfterBreak="0">
     <w:nsid w:val="62662502"/>
     <w:multiLevelType w:val="multilevel"/>
     <w:tmpl w:val="D8F4980C"/>
@@ -5243,7 +5808,7 @@
       </w:rPr>
     </w:lvl>
   </w:abstractNum>
-  <w:abstractNum w:abstractNumId="15" w15:restartNumberingAfterBreak="0">
+  <w:abstractNum w:abstractNumId="16" w15:restartNumberingAfterBreak="0">
     <w:nsid w:val="66F05923"/>
     <w:multiLevelType w:val="multilevel"/>
     <w:tmpl w:val="B97C5258"/>
@@ -5392,7 +5957,7 @@
       </w:rPr>
     </w:lvl>
   </w:abstractNum>
-  <w:abstractNum w:abstractNumId="16" w15:restartNumberingAfterBreak="0">
+  <w:abstractNum w:abstractNumId="17" w15:restartNumberingAfterBreak="0">
     <w:nsid w:val="68206611"/>
     <w:multiLevelType w:val="multilevel"/>
     <w:tmpl w:val="CD001B12"/>
@@ -5541,7 +6106,7 @@
       </w:rPr>
     </w:lvl>
   </w:abstractNum>
-  <w:abstractNum w:abstractNumId="17" w15:restartNumberingAfterBreak="0">
+  <w:abstractNum w:abstractNumId="18" w15:restartNumberingAfterBreak="0">
     <w:nsid w:val="6D5365B0"/>
     <w:multiLevelType w:val="multilevel"/>
     <w:tmpl w:val="A3187610"/>
@@ -5690,7 +6255,7 @@
       </w:rPr>
     </w:lvl>
   </w:abstractNum>
-  <w:abstractNum w:abstractNumId="18" w15:restartNumberingAfterBreak="0">
+  <w:abstractNum w:abstractNumId="19" w15:restartNumberingAfterBreak="0">
     <w:nsid w:val="70357364"/>
     <w:multiLevelType w:val="multilevel"/>
     <w:tmpl w:val="1876AB82"/>
@@ -5843,58 +6408,61 @@
     <w:abstractNumId w:val="2"/>
   </w:num>
   <w:num w:numId="2" w16cid:durableId="1556501285">
-    <w:abstractNumId w:val="12"/>
+    <w:abstractNumId w:val="13"/>
   </w:num>
   <w:num w:numId="3" w16cid:durableId="1687903399">
-    <w:abstractNumId w:val="16"/>
+    <w:abstractNumId w:val="17"/>
   </w:num>
   <w:num w:numId="4" w16cid:durableId="832068384">
-    <w:abstractNumId w:val="6"/>
+    <w:abstractNumId w:val="7"/>
   </w:num>
   <w:num w:numId="5" w16cid:durableId="1007633576">
     <w:abstractNumId w:val="1"/>
   </w:num>
   <w:num w:numId="6" w16cid:durableId="1267232780">
+    <w:abstractNumId w:val="5"/>
+  </w:num>
+  <w:num w:numId="7" w16cid:durableId="1908807499">
+    <w:abstractNumId w:val="10"/>
+  </w:num>
+  <w:num w:numId="8" w16cid:durableId="2115053002">
+    <w:abstractNumId w:val="9"/>
+  </w:num>
+  <w:num w:numId="9" w16cid:durableId="1239098229">
+    <w:abstractNumId w:val="16"/>
+  </w:num>
+  <w:num w:numId="10" w16cid:durableId="1236550901">
+    <w:abstractNumId w:val="15"/>
+  </w:num>
+  <w:num w:numId="11" w16cid:durableId="1546873734">
     <w:abstractNumId w:val="4"/>
   </w:num>
-  <w:num w:numId="7" w16cid:durableId="1908807499">
-    <w:abstractNumId w:val="9"/>
-  </w:num>
-  <w:num w:numId="8" w16cid:durableId="2115053002">
-    <w:abstractNumId w:val="8"/>
-  </w:num>
-  <w:num w:numId="9" w16cid:durableId="1239098229">
-    <w:abstractNumId w:val="15"/>
-  </w:num>
-  <w:num w:numId="10" w16cid:durableId="1236550901">
-    <w:abstractNumId w:val="14"/>
-  </w:num>
-  <w:num w:numId="11" w16cid:durableId="1546873734">
-    <w:abstractNumId w:val="3"/>
-  </w:num>
   <w:num w:numId="12" w16cid:durableId="1111318964">
-    <w:abstractNumId w:val="5"/>
+    <w:abstractNumId w:val="6"/>
   </w:num>
   <w:num w:numId="13" w16cid:durableId="277761584">
-    <w:abstractNumId w:val="18"/>
+    <w:abstractNumId w:val="19"/>
   </w:num>
   <w:num w:numId="14" w16cid:durableId="226961380">
-    <w:abstractNumId w:val="11"/>
+    <w:abstractNumId w:val="12"/>
   </w:num>
   <w:num w:numId="15" w16cid:durableId="1366710373">
     <w:abstractNumId w:val="0"/>
   </w:num>
   <w:num w:numId="16" w16cid:durableId="1436436059">
-    <w:abstractNumId w:val="17"/>
+    <w:abstractNumId w:val="18"/>
   </w:num>
   <w:num w:numId="17" w16cid:durableId="815953653">
-    <w:abstractNumId w:val="10"/>
+    <w:abstractNumId w:val="11"/>
   </w:num>
   <w:num w:numId="18" w16cid:durableId="356202626">
-    <w:abstractNumId w:val="13"/>
+    <w:abstractNumId w:val="14"/>
   </w:num>
   <w:num w:numId="19" w16cid:durableId="2015569091">
-    <w:abstractNumId w:val="7"/>
+    <w:abstractNumId w:val="8"/>
+  </w:num>
+  <w:num w:numId="20" w16cid:durableId="2043507897">
+    <w:abstractNumId w:val="3"/>
   </w:num>
 </w:numbering>
 </file>

</xml_diff>